<commit_message>
Close two methodological gaps: 5-fold CV + LogReg/DTree baselines
- analyze.py: append StratifiedKFold cross_validate (acc/prec/recall/F1)
  on the Random Forest, plus LogisticRegression and DecisionTreeClassifier
  on the same 80/20 split. Existing ===RF=== output unchanged so numbers
  hardcoded in web/charts/risk.js remain valid.
- REPORT.md: §4.4 documents the CV protocol; new §4.4.1 introduces the
  baselines. §7.3 becomes a 3-model comparison (Table 5) plus a CV
  summary (Table 5b) with an interpretation paragraph on the
  recall-precision trade-off. §8.2 drops the "single hold-out" bullet
  (now closed) and renumbers to four.
- README.md: At-a-Glance gains two rows (5-fold CV, baselines); §1 Key
  empirical findings expands the RF bullet; §7 reproduce notes the new
  output blocks.
- REPORT.docx regenerated.

No frontend changes (web/ untouched).

Co-Authored-By: Claude Opus 4.7 (1M context) <noreply@anthropic.com>
</commit_message>
<xml_diff>
--- a/REPORT.docx
+++ b/REPORT.docx
@@ -5017,7 +5017,149 @@
           <w:rFonts w:ascii="Times New Roman" w:hAnsi="Times New Roman"/>
           <w:sz w:val="24"/>
         </w:rPr>
-        <w:t xml:space="preserve"> We compute accuracy, precision, recall, F1, and the confusion matrix on the held-out test set. We do not use cross-validation in the deployed pipeline; this is acknowledged as a limitation (§8.2).</w:t>
+        <w:t xml:space="preserve"> We compute accuracy, precision, recall, F1, and the confusion matrix on the held-out test set. To complement the held-out evaluation, we additionally report </w:t>
+      </w:r>
+      <w:r>
+        <w:rPr>
+          <w:rFonts w:ascii="Times New Roman" w:hAnsi="Times New Roman"/>
+          <w:b/>
+          <w:sz w:val="24"/>
+        </w:rPr>
+        <w:t>5-fold stratified cross-validation</w:t>
+      </w:r>
+      <w:r>
+        <w:rPr>
+          <w:rFonts w:ascii="Times New Roman" w:hAnsi="Times New Roman"/>
+          <w:sz w:val="24"/>
+        </w:rPr>
+        <w:t xml:space="preserve"> (</w:t>
+      </w:r>
+      <w:r>
+        <w:rPr>
+          <w:rFonts w:ascii="Consolas" w:hAnsi="Consolas"/>
+          <w:sz w:val="20"/>
+        </w:rPr>
+        <w:t>StratifiedKFold</w:t>
+      </w:r>
+      <w:r>
+        <w:rPr>
+          <w:rFonts w:ascii="Times New Roman" w:hAnsi="Times New Roman"/>
+          <w:sz w:val="24"/>
+        </w:rPr>
+        <w:t xml:space="preserve">, </w:t>
+      </w:r>
+      <w:r>
+        <w:rPr>
+          <w:rFonts w:ascii="Consolas" w:hAnsi="Consolas"/>
+          <w:sz w:val="20"/>
+        </w:rPr>
+        <w:t>shuffle=True</w:t>
+      </w:r>
+      <w:r>
+        <w:rPr>
+          <w:rFonts w:ascii="Times New Roman" w:hAnsi="Times New Roman"/>
+          <w:sz w:val="24"/>
+        </w:rPr>
+        <w:t xml:space="preserve">, </w:t>
+      </w:r>
+      <w:r>
+        <w:rPr>
+          <w:rFonts w:ascii="Consolas" w:hAnsi="Consolas"/>
+          <w:sz w:val="20"/>
+        </w:rPr>
+        <w:t>random_state=42</w:t>
+      </w:r>
+      <w:r>
+        <w:rPr>
+          <w:rFonts w:ascii="Times New Roman" w:hAnsi="Times New Roman"/>
+          <w:sz w:val="24"/>
+        </w:rPr>
+        <w:t xml:space="preserve">) over the full cohort, scoring on accuracy, precision, recall, and F1. The CV results in §7.3 are the methodologically primary numbers; the hold-out matrix (Table 6) is retained so the operational cost of each cell (caught, false alarm, </w:t>
+      </w:r>
+      <w:r>
+        <w:rPr>
+          <w:rFonts w:ascii="Times New Roman" w:hAnsi="Times New Roman"/>
+          <w:b/>
+          <w:sz w:val="24"/>
+        </w:rPr>
+        <w:t>MISSED</w:t>
+      </w:r>
+      <w:r>
+        <w:rPr>
+          <w:rFonts w:ascii="Times New Roman" w:hAnsi="Times New Roman"/>
+          <w:sz w:val="24"/>
+        </w:rPr>
+        <w:t>, all-clear) can be interpreted directly.</w:t>
+      </w:r>
+    </w:p>
+    <w:p>
+      <w:pPr>
+        <w:keepNext/>
+        <w:spacing w:before="200" w:after="80"/>
+        <w:jc w:val="left"/>
+      </w:pPr>
+      <w:r>
+        <w:rPr>
+          <w:rFonts w:ascii="Times New Roman" w:hAnsi="Times New Roman"/>
+          <w:b/>
+          <w:sz w:val="24"/>
+        </w:rPr>
+        <w:t>4.4.1 Baseline models</w:t>
+      </w:r>
+    </w:p>
+    <w:p>
+      <w:pPr>
+        <w:spacing w:lineRule="auto" w:line="276" w:after="120"/>
+        <w:jc w:val="both"/>
+      </w:pPr>
+      <w:r>
+        <w:rPr>
+          <w:rFonts w:ascii="Times New Roman" w:hAnsi="Times New Roman"/>
+          <w:sz w:val="24"/>
+        </w:rPr>
+        <w:t xml:space="preserve">For comparison we train two baselines on the same stratified 80/20 split. (i) </w:t>
+      </w:r>
+      <w:r>
+        <w:rPr>
+          <w:rFonts w:ascii="Consolas" w:hAnsi="Consolas"/>
+          <w:sz w:val="20"/>
+        </w:rPr>
+        <w:t>LogisticRegression(class_weight="balanced", max_iter=1000, random_state=42)</w:t>
+      </w:r>
+      <w:r>
+        <w:rPr>
+          <w:rFonts w:ascii="Times New Roman" w:hAnsi="Times New Roman"/>
+          <w:sz w:val="24"/>
+        </w:rPr>
+        <w:t xml:space="preserve"> on standardised features (a </w:t>
+      </w:r>
+      <w:r>
+        <w:rPr>
+          <w:rFonts w:ascii="Consolas" w:hAnsi="Consolas"/>
+          <w:sz w:val="20"/>
+        </w:rPr>
+        <w:t>StandardScaler</w:t>
+      </w:r>
+      <w:r>
+        <w:rPr>
+          <w:rFonts w:ascii="Times New Roman" w:hAnsi="Times New Roman"/>
+          <w:sz w:val="24"/>
+        </w:rPr>
+        <w:t xml:space="preserve"> is fit on the training split and applied to the test split). (ii) </w:t>
+      </w:r>
+      <w:r>
+        <w:rPr>
+          <w:rFonts w:ascii="Consolas" w:hAnsi="Consolas"/>
+          <w:sz w:val="20"/>
+        </w:rPr>
+        <w:t>DecisionTreeClassifier(class_weight="balanced", random_state=42)</w:t>
+      </w:r>
+      <w:r>
+        <w:rPr>
+          <w:rFonts w:ascii="Times New Roman" w:hAnsi="Times New Roman"/>
+          <w:sz w:val="24"/>
+        </w:rPr>
+        <w:t xml:space="preserve"> on the raw features. Both baselines are evaluated with the same recall-led framing as the Random Forest. We report the comparison in §7.3 (Table 5).</w:t>
       </w:r>
     </w:p>
     <w:p>
@@ -10154,7 +10296,7 @@
           <w:b/>
           <w:sz w:val="24"/>
         </w:rPr>
-        <w:t>7.3 Random Forest performance (RQ4)</w:t>
+        <w:t>7.3 Classifier performance (RQ4)</w:t>
       </w:r>
     </w:p>
     <w:p>
@@ -10167,7 +10309,7 @@
           <w:rFonts w:ascii="Times New Roman" w:hAnsi="Times New Roman"/>
           <w:sz w:val="24"/>
         </w:rPr>
-        <w:t>On the held-out test set (n = 209, of which 46 are at-risk), the Random Forest classifier achieves the following metrics:</w:t>
+        <w:t>We report three classifiers on the held-out test set (n = 209, of which 46 are at-risk), and a 5-fold stratified cross-validation summary on the Random Forest.</w:t>
       </w:r>
     </w:p>
     <w:p>
@@ -10181,7 +10323,7 @@
           <w:b/>
           <w:sz w:val="24"/>
         </w:rPr>
-        <w:t>Table 5 — Random Forest test-set performance</w:t>
+        <w:t>Table 5 — Held-out test-set performance for the three classifiers (n = 209)</w:t>
       </w:r>
     </w:p>
     <w:tbl>
@@ -10191,13 +10333,15 @@
         <w:tblLook w:firstColumn="1" w:firstRow="1" w:lastColumn="0" w:lastRow="0" w:noHBand="0" w:noVBand="1" w:val="04A0"/>
       </w:tblPr>
       <w:tblGrid>
-        <w:gridCol w:w="4680"/>
-        <w:gridCol w:w="4680"/>
+        <w:gridCol w:w="2340"/>
+        <w:gridCol w:w="2340"/>
+        <w:gridCol w:w="2340"/>
+        <w:gridCol w:w="2340"/>
       </w:tblGrid>
       <w:tr>
         <w:tc>
           <w:tcPr>
-            <w:tcW w:type="dxa" w:w="4680"/>
+            <w:tcW w:type="dxa" w:w="2340"/>
             <w:vAlign w:val="top"/>
             <w:tcBorders>
               <w:top w:val="single" w:sz="6" w:color="BFBFBF"/>
@@ -10230,7 +10374,7 @@
         </w:tc>
         <w:tc>
           <w:tcPr>
-            <w:tcW w:type="dxa" w:w="4680"/>
+            <w:tcW w:type="dxa" w:w="2340"/>
             <w:vAlign w:val="top"/>
             <w:tcBorders>
               <w:top w:val="single" w:sz="6" w:color="BFBFBF"/>
@@ -10257,7 +10401,73 @@
                 <w:b/>
                 <w:sz w:val="20"/>
               </w:rPr>
-              <w:t>Value</w:t>
+              <w:t>Logistic Regression</w:t>
+            </w:r>
+          </w:p>
+        </w:tc>
+        <w:tc>
+          <w:tcPr>
+            <w:tcW w:type="dxa" w:w="2340"/>
+            <w:vAlign w:val="top"/>
+            <w:tcBorders>
+              <w:top w:val="single" w:sz="6" w:color="BFBFBF"/>
+              <w:left w:val="single" w:sz="6" w:color="BFBFBF"/>
+              <w:bottom w:val="single" w:sz="6" w:color="BFBFBF"/>
+              <w:right w:val="single" w:sz="6" w:color="BFBFBF"/>
+            </w:tcBorders>
+            <w:shd w:val="clear" w:color="auto" w:fill="D9E1F2"/>
+          </w:tcPr>
+          <w:p>
+            <w:pPr>
+              <w:spacing w:after="40"/>
+            </w:pPr>
+            <w:r>
+              <w:rPr>
+                <w:rFonts w:ascii="Times New Roman" w:hAnsi="Times New Roman"/>
+                <w:b/>
+                <w:sz w:val="20"/>
+              </w:rPr>
+            </w:r>
+            <w:r>
+              <w:rPr>
+                <w:rFonts w:ascii="Times New Roman" w:hAnsi="Times New Roman"/>
+                <w:b/>
+                <w:sz w:val="20"/>
+              </w:rPr>
+              <w:t>Decision Tree</w:t>
+            </w:r>
+          </w:p>
+        </w:tc>
+        <w:tc>
+          <w:tcPr>
+            <w:tcW w:type="dxa" w:w="2340"/>
+            <w:vAlign w:val="top"/>
+            <w:tcBorders>
+              <w:top w:val="single" w:sz="6" w:color="BFBFBF"/>
+              <w:left w:val="single" w:sz="6" w:color="BFBFBF"/>
+              <w:bottom w:val="single" w:sz="6" w:color="BFBFBF"/>
+              <w:right w:val="single" w:sz="6" w:color="BFBFBF"/>
+            </w:tcBorders>
+            <w:shd w:val="clear" w:color="auto" w:fill="D9E1F2"/>
+          </w:tcPr>
+          <w:p>
+            <w:pPr>
+              <w:spacing w:after="40"/>
+            </w:pPr>
+            <w:r>
+              <w:rPr>
+                <w:rFonts w:ascii="Times New Roman" w:hAnsi="Times New Roman"/>
+                <w:b/>
+                <w:sz w:val="20"/>
+              </w:rPr>
+            </w:r>
+            <w:r>
+              <w:rPr>
+                <w:rFonts w:ascii="Times New Roman" w:hAnsi="Times New Roman"/>
+                <w:b/>
+                <w:sz w:val="20"/>
+              </w:rPr>
+              <w:t>Random Forest</w:t>
             </w:r>
           </w:p>
         </w:tc>
@@ -10265,7 +10475,7 @@
       <w:tr>
         <w:tc>
           <w:tcPr>
-            <w:tcW w:type="dxa" w:w="4680"/>
+            <w:tcW w:type="dxa" w:w="2340"/>
             <w:vAlign w:val="top"/>
             <w:tcBorders>
               <w:top w:val="single" w:sz="6" w:color="BFBFBF"/>
@@ -10295,7 +10505,7 @@
         </w:tc>
         <w:tc>
           <w:tcPr>
-            <w:tcW w:type="dxa" w:w="4680"/>
+            <w:tcW w:type="dxa" w:w="2340"/>
             <w:vAlign w:val="top"/>
             <w:tcBorders>
               <w:top w:val="single" w:sz="6" w:color="BFBFBF"/>
@@ -10319,15 +10529,13 @@
                 <w:rFonts w:ascii="Times New Roman" w:hAnsi="Times New Roman"/>
                 <w:sz w:val="20"/>
               </w:rPr>
-              <w:t>91.4%</w:t>
+              <w:t>88.0%</w:t>
             </w:r>
           </w:p>
         </w:tc>
-      </w:tr>
-      <w:tr>
         <w:tc>
           <w:tcPr>
-            <w:tcW w:type="dxa" w:w="4680"/>
+            <w:tcW w:type="dxa" w:w="2340"/>
             <w:vAlign w:val="top"/>
             <w:tcBorders>
               <w:top w:val="single" w:sz="6" w:color="BFBFBF"/>
@@ -10351,13 +10559,13 @@
                 <w:rFonts w:ascii="Times New Roman" w:hAnsi="Times New Roman"/>
                 <w:sz w:val="20"/>
               </w:rPr>
-              <w:t>Precision (at-risk)</w:t>
+              <w:t>88.0%</w:t>
             </w:r>
           </w:p>
         </w:tc>
         <w:tc>
           <w:tcPr>
-            <w:tcW w:type="dxa" w:w="4680"/>
+            <w:tcW w:type="dxa" w:w="2340"/>
             <w:vAlign w:val="top"/>
             <w:tcBorders>
               <w:top w:val="single" w:sz="6" w:color="BFBFBF"/>
@@ -10379,9 +10587,10 @@
             <w:r>
               <w:rPr>
                 <w:rFonts w:ascii="Times New Roman" w:hAnsi="Times New Roman"/>
-                <w:sz w:val="20"/>
-              </w:rPr>
-              <w:t>79.2%</w:t>
+                <w:b/>
+                <w:sz w:val="20"/>
+              </w:rPr>
+              <w:t>91.4%</w:t>
             </w:r>
           </w:p>
         </w:tc>
@@ -10389,7 +10598,7 @@
       <w:tr>
         <w:tc>
           <w:tcPr>
-            <w:tcW w:type="dxa" w:w="4680"/>
+            <w:tcW w:type="dxa" w:w="2340"/>
             <w:vAlign w:val="top"/>
             <w:tcBorders>
               <w:top w:val="single" w:sz="6" w:color="BFBFBF"/>
@@ -10411,16 +10620,15 @@
             <w:r>
               <w:rPr>
                 <w:rFonts w:ascii="Times New Roman" w:hAnsi="Times New Roman"/>
-                <w:b/>
-                <w:sz w:val="20"/>
-              </w:rPr>
-              <w:t>Recall (at-risk)</w:t>
+                <w:sz w:val="20"/>
+              </w:rPr>
+              <w:t>Precision (at-risk)</w:t>
             </w:r>
           </w:p>
         </w:tc>
         <w:tc>
           <w:tcPr>
-            <w:tcW w:type="dxa" w:w="4680"/>
+            <w:tcW w:type="dxa" w:w="2340"/>
             <w:vAlign w:val="top"/>
             <w:tcBorders>
               <w:top w:val="single" w:sz="6" w:color="BFBFBF"/>
@@ -10442,18 +10650,15 @@
             <w:r>
               <w:rPr>
                 <w:rFonts w:ascii="Times New Roman" w:hAnsi="Times New Roman"/>
-                <w:b/>
-                <w:sz w:val="20"/>
-              </w:rPr>
-              <w:t>82.6%</w:t>
+                <w:sz w:val="20"/>
+              </w:rPr>
+              <w:t>66.7%</w:t>
             </w:r>
           </w:p>
         </w:tc>
-      </w:tr>
-      <w:tr>
         <w:tc>
           <w:tcPr>
-            <w:tcW w:type="dxa" w:w="4680"/>
+            <w:tcW w:type="dxa" w:w="2340"/>
             <w:vAlign w:val="top"/>
             <w:tcBorders>
               <w:top w:val="single" w:sz="6" w:color="BFBFBF"/>
@@ -10477,13 +10682,13 @@
                 <w:rFonts w:ascii="Times New Roman" w:hAnsi="Times New Roman"/>
                 <w:sz w:val="20"/>
               </w:rPr>
-              <w:t>F1 (at-risk)</w:t>
+              <w:t>71.4%</w:t>
             </w:r>
           </w:p>
         </w:tc>
         <w:tc>
           <w:tcPr>
-            <w:tcW w:type="dxa" w:w="4680"/>
+            <w:tcW w:type="dxa" w:w="2340"/>
             <w:vAlign w:val="top"/>
             <w:tcBorders>
               <w:top w:val="single" w:sz="6" w:color="BFBFBF"/>
@@ -10505,6 +10710,253 @@
             <w:r>
               <w:rPr>
                 <w:rFonts w:ascii="Times New Roman" w:hAnsi="Times New Roman"/>
+                <w:b/>
+                <w:sz w:val="20"/>
+              </w:rPr>
+              <w:t>79.2%</w:t>
+            </w:r>
+          </w:p>
+        </w:tc>
+      </w:tr>
+      <w:tr>
+        <w:tc>
+          <w:tcPr>
+            <w:tcW w:type="dxa" w:w="2340"/>
+            <w:vAlign w:val="top"/>
+            <w:tcBorders>
+              <w:top w:val="single" w:sz="6" w:color="BFBFBF"/>
+              <w:left w:val="single" w:sz="6" w:color="BFBFBF"/>
+              <w:bottom w:val="single" w:sz="6" w:color="BFBFBF"/>
+              <w:right w:val="single" w:sz="6" w:color="BFBFBF"/>
+            </w:tcBorders>
+          </w:tcPr>
+          <w:p>
+            <w:pPr>
+              <w:spacing w:after="40"/>
+            </w:pPr>
+            <w:r>
+              <w:rPr>
+                <w:rFonts w:ascii="Times New Roman" w:hAnsi="Times New Roman"/>
+                <w:sz w:val="20"/>
+              </w:rPr>
+            </w:r>
+            <w:r>
+              <w:rPr>
+                <w:rFonts w:ascii="Times New Roman" w:hAnsi="Times New Roman"/>
+                <w:sz w:val="20"/>
+              </w:rPr>
+              <w:t>Recall (at-risk)</w:t>
+            </w:r>
+          </w:p>
+        </w:tc>
+        <w:tc>
+          <w:tcPr>
+            <w:tcW w:type="dxa" w:w="2340"/>
+            <w:vAlign w:val="top"/>
+            <w:tcBorders>
+              <w:top w:val="single" w:sz="6" w:color="BFBFBF"/>
+              <w:left w:val="single" w:sz="6" w:color="BFBFBF"/>
+              <w:bottom w:val="single" w:sz="6" w:color="BFBFBF"/>
+              <w:right w:val="single" w:sz="6" w:color="BFBFBF"/>
+            </w:tcBorders>
+          </w:tcPr>
+          <w:p>
+            <w:pPr>
+              <w:spacing w:after="40"/>
+            </w:pPr>
+            <w:r>
+              <w:rPr>
+                <w:rFonts w:ascii="Times New Roman" w:hAnsi="Times New Roman"/>
+                <w:sz w:val="20"/>
+              </w:rPr>
+            </w:r>
+            <w:r>
+              <w:rPr>
+                <w:rFonts w:ascii="Times New Roman" w:hAnsi="Times New Roman"/>
+                <w:b/>
+                <w:sz w:val="20"/>
+              </w:rPr>
+              <w:t>91.3%</w:t>
+            </w:r>
+          </w:p>
+        </w:tc>
+        <w:tc>
+          <w:tcPr>
+            <w:tcW w:type="dxa" w:w="2340"/>
+            <w:vAlign w:val="top"/>
+            <w:tcBorders>
+              <w:top w:val="single" w:sz="6" w:color="BFBFBF"/>
+              <w:left w:val="single" w:sz="6" w:color="BFBFBF"/>
+              <w:bottom w:val="single" w:sz="6" w:color="BFBFBF"/>
+              <w:right w:val="single" w:sz="6" w:color="BFBFBF"/>
+            </w:tcBorders>
+          </w:tcPr>
+          <w:p>
+            <w:pPr>
+              <w:spacing w:after="40"/>
+            </w:pPr>
+            <w:r>
+              <w:rPr>
+                <w:rFonts w:ascii="Times New Roman" w:hAnsi="Times New Roman"/>
+                <w:sz w:val="20"/>
+              </w:rPr>
+            </w:r>
+            <w:r>
+              <w:rPr>
+                <w:rFonts w:ascii="Times New Roman" w:hAnsi="Times New Roman"/>
+                <w:sz w:val="20"/>
+              </w:rPr>
+              <w:t>76.1%</w:t>
+            </w:r>
+          </w:p>
+        </w:tc>
+        <w:tc>
+          <w:tcPr>
+            <w:tcW w:type="dxa" w:w="2340"/>
+            <w:vAlign w:val="top"/>
+            <w:tcBorders>
+              <w:top w:val="single" w:sz="6" w:color="BFBFBF"/>
+              <w:left w:val="single" w:sz="6" w:color="BFBFBF"/>
+              <w:bottom w:val="single" w:sz="6" w:color="BFBFBF"/>
+              <w:right w:val="single" w:sz="6" w:color="BFBFBF"/>
+            </w:tcBorders>
+          </w:tcPr>
+          <w:p>
+            <w:pPr>
+              <w:spacing w:after="40"/>
+            </w:pPr>
+            <w:r>
+              <w:rPr>
+                <w:rFonts w:ascii="Times New Roman" w:hAnsi="Times New Roman"/>
+                <w:sz w:val="20"/>
+              </w:rPr>
+            </w:r>
+            <w:r>
+              <w:rPr>
+                <w:rFonts w:ascii="Times New Roman" w:hAnsi="Times New Roman"/>
+                <w:sz w:val="20"/>
+              </w:rPr>
+              <w:t>82.6%</w:t>
+            </w:r>
+          </w:p>
+        </w:tc>
+      </w:tr>
+      <w:tr>
+        <w:tc>
+          <w:tcPr>
+            <w:tcW w:type="dxa" w:w="2340"/>
+            <w:vAlign w:val="top"/>
+            <w:tcBorders>
+              <w:top w:val="single" w:sz="6" w:color="BFBFBF"/>
+              <w:left w:val="single" w:sz="6" w:color="BFBFBF"/>
+              <w:bottom w:val="single" w:sz="6" w:color="BFBFBF"/>
+              <w:right w:val="single" w:sz="6" w:color="BFBFBF"/>
+            </w:tcBorders>
+          </w:tcPr>
+          <w:p>
+            <w:pPr>
+              <w:spacing w:after="40"/>
+            </w:pPr>
+            <w:r>
+              <w:rPr>
+                <w:rFonts w:ascii="Times New Roman" w:hAnsi="Times New Roman"/>
+                <w:sz w:val="20"/>
+              </w:rPr>
+            </w:r>
+            <w:r>
+              <w:rPr>
+                <w:rFonts w:ascii="Times New Roman" w:hAnsi="Times New Roman"/>
+                <w:sz w:val="20"/>
+              </w:rPr>
+              <w:t>F1 (at-risk)</w:t>
+            </w:r>
+          </w:p>
+        </w:tc>
+        <w:tc>
+          <w:tcPr>
+            <w:tcW w:type="dxa" w:w="2340"/>
+            <w:vAlign w:val="top"/>
+            <w:tcBorders>
+              <w:top w:val="single" w:sz="6" w:color="BFBFBF"/>
+              <w:left w:val="single" w:sz="6" w:color="BFBFBF"/>
+              <w:bottom w:val="single" w:sz="6" w:color="BFBFBF"/>
+              <w:right w:val="single" w:sz="6" w:color="BFBFBF"/>
+            </w:tcBorders>
+          </w:tcPr>
+          <w:p>
+            <w:pPr>
+              <w:spacing w:after="40"/>
+            </w:pPr>
+            <w:r>
+              <w:rPr>
+                <w:rFonts w:ascii="Times New Roman" w:hAnsi="Times New Roman"/>
+                <w:sz w:val="20"/>
+              </w:rPr>
+            </w:r>
+            <w:r>
+              <w:rPr>
+                <w:rFonts w:ascii="Times New Roman" w:hAnsi="Times New Roman"/>
+                <w:sz w:val="20"/>
+              </w:rPr>
+              <w:t>77.1%</w:t>
+            </w:r>
+          </w:p>
+        </w:tc>
+        <w:tc>
+          <w:tcPr>
+            <w:tcW w:type="dxa" w:w="2340"/>
+            <w:vAlign w:val="top"/>
+            <w:tcBorders>
+              <w:top w:val="single" w:sz="6" w:color="BFBFBF"/>
+              <w:left w:val="single" w:sz="6" w:color="BFBFBF"/>
+              <w:bottom w:val="single" w:sz="6" w:color="BFBFBF"/>
+              <w:right w:val="single" w:sz="6" w:color="BFBFBF"/>
+            </w:tcBorders>
+          </w:tcPr>
+          <w:p>
+            <w:pPr>
+              <w:spacing w:after="40"/>
+            </w:pPr>
+            <w:r>
+              <w:rPr>
+                <w:rFonts w:ascii="Times New Roman" w:hAnsi="Times New Roman"/>
+                <w:sz w:val="20"/>
+              </w:rPr>
+            </w:r>
+            <w:r>
+              <w:rPr>
+                <w:rFonts w:ascii="Times New Roman" w:hAnsi="Times New Roman"/>
+                <w:sz w:val="20"/>
+              </w:rPr>
+              <w:t>73.7%</w:t>
+            </w:r>
+          </w:p>
+        </w:tc>
+        <w:tc>
+          <w:tcPr>
+            <w:tcW w:type="dxa" w:w="2340"/>
+            <w:vAlign w:val="top"/>
+            <w:tcBorders>
+              <w:top w:val="single" w:sz="6" w:color="BFBFBF"/>
+              <w:left w:val="single" w:sz="6" w:color="BFBFBF"/>
+              <w:bottom w:val="single" w:sz="6" w:color="BFBFBF"/>
+              <w:right w:val="single" w:sz="6" w:color="BFBFBF"/>
+            </w:tcBorders>
+          </w:tcPr>
+          <w:p>
+            <w:pPr>
+              <w:spacing w:after="40"/>
+            </w:pPr>
+            <w:r>
+              <w:rPr>
+                <w:rFonts w:ascii="Times New Roman" w:hAnsi="Times New Roman"/>
+                <w:sz w:val="20"/>
+              </w:rPr>
+            </w:r>
+            <w:r>
+              <w:rPr>
+                <w:rFonts w:ascii="Times New Roman" w:hAnsi="Times New Roman"/>
+                <w:b/>
                 <w:sz w:val="20"/>
               </w:rPr>
               <w:t>80.9%</w:t>
@@ -10528,7 +10980,37 @@
           <w:rFonts w:ascii="Times New Roman" w:hAnsi="Times New Roman"/>
           <w:sz w:val="24"/>
         </w:rPr>
-        <w:t>The confusion matrix (Table 6) decomposes these aggregate metrics into the four operational outcomes.</w:t>
+        <w:t xml:space="preserve">The three models present a clear </w:t>
+      </w:r>
+      <w:r>
+        <w:rPr>
+          <w:rFonts w:ascii="Times New Roman" w:hAnsi="Times New Roman"/>
+          <w:i/>
+          <w:sz w:val="24"/>
+        </w:rPr>
+        <w:t>recall–precision trade-off</w:t>
+      </w:r>
+      <w:r>
+        <w:rPr>
+          <w:rFonts w:ascii="Times New Roman" w:hAnsi="Times New Roman"/>
+          <w:sz w:val="24"/>
+        </w:rPr>
+        <w:t xml:space="preserve">. Logistic Regression catches the most at-risk students (recall 91.3%, missing only 4 of 46), but at the cost of 21 false alarms (precision 66.7%). The Decision Tree behaves in the opposite direction, missing 11 of 46 at-risk students. The Random Forest sits between the two, achieving the highest F1 (80.9%) — the best-balanced choice given an early-warning use case that values both catching at-risk students </w:t>
+      </w:r>
+      <w:r>
+        <w:rPr>
+          <w:rFonts w:ascii="Times New Roman" w:hAnsi="Times New Roman"/>
+          <w:i/>
+          <w:sz w:val="24"/>
+        </w:rPr>
+        <w:t>and</w:t>
+      </w:r>
+      <w:r>
+        <w:rPr>
+          <w:rFonts w:ascii="Times New Roman" w:hAnsi="Times New Roman"/>
+          <w:sz w:val="24"/>
+        </w:rPr>
+        <w:t xml:space="preserve"> not over-flagging the cohort. We adopt the Random Forest as the deployed model in the dashboard, while reporting Logistic Regression openly as a viable alternative if a school's intervention budget makes false alarms cheap.</w:t>
       </w:r>
     </w:p>
     <w:p>
@@ -10542,7 +11024,7 @@
           <w:b/>
           <w:sz w:val="24"/>
         </w:rPr>
-        <w:t>Table 6 — Confusion matrix on the held-out test set</w:t>
+        <w:t>Table 5b — 5-fold stratified cross-validation on the Random Forest</w:t>
       </w:r>
     </w:p>
     <w:tbl>
@@ -10580,6 +11062,14 @@
                 <w:sz w:val="20"/>
               </w:rPr>
             </w:r>
+            <w:r>
+              <w:rPr>
+                <w:rFonts w:ascii="Times New Roman" w:hAnsi="Times New Roman"/>
+                <w:b/>
+                <w:sz w:val="20"/>
+              </w:rPr>
+              <w:t>Metric</w:t>
+            </w:r>
           </w:p>
         </w:tc>
         <w:tc>
@@ -10611,7 +11101,7 @@
                 <w:b/>
                 <w:sz w:val="20"/>
               </w:rPr>
-              <w:t>Predicted Pass</w:t>
+              <w:t>Mean</w:t>
             </w:r>
           </w:p>
         </w:tc>
@@ -10644,7 +11134,7 @@
                 <w:b/>
                 <w:sz w:val="20"/>
               </w:rPr>
-              <w:t>Predicted At-Risk</w:t>
+              <w:t>Std</w:t>
             </w:r>
           </w:p>
         </w:tc>
@@ -10674,17 +11164,9 @@
             <w:r>
               <w:rPr>
                 <w:rFonts w:ascii="Times New Roman" w:hAnsi="Times New Roman"/>
-                <w:b/>
-                <w:sz w:val="20"/>
-              </w:rPr>
-              <w:t>Actually Pass</w:t>
-            </w:r>
-            <w:r>
-              <w:rPr>
-                <w:rFonts w:ascii="Times New Roman" w:hAnsi="Times New Roman"/>
-                <w:sz w:val="20"/>
-              </w:rPr>
-              <w:t xml:space="preserve"> (n = 163)</w:t>
+                <w:sz w:val="20"/>
+              </w:rPr>
+              <w:t>Accuracy</w:t>
             </w:r>
           </w:p>
         </w:tc>
@@ -10714,7 +11196,7 @@
                 <w:rFonts w:ascii="Times New Roman" w:hAnsi="Times New Roman"/>
                 <w:sz w:val="20"/>
               </w:rPr>
-              <w:t>TN = 153 (94%)</w:t>
+              <w:t>92.4%</w:t>
             </w:r>
           </w:p>
         </w:tc>
@@ -10744,7 +11226,7 @@
                 <w:rFonts w:ascii="Times New Roman" w:hAnsi="Times New Roman"/>
                 <w:sz w:val="20"/>
               </w:rPr>
-              <w:t>FP = 10 (6%)</w:t>
+              <w:t>± 1.2 pp</w:t>
             </w:r>
           </w:p>
         </w:tc>
@@ -10774,17 +11256,9 @@
             <w:r>
               <w:rPr>
                 <w:rFonts w:ascii="Times New Roman" w:hAnsi="Times New Roman"/>
-                <w:b/>
-                <w:sz w:val="20"/>
-              </w:rPr>
-              <w:t>Actually At-Risk</w:t>
-            </w:r>
-            <w:r>
-              <w:rPr>
-                <w:rFonts w:ascii="Times New Roman" w:hAnsi="Times New Roman"/>
-                <w:sz w:val="20"/>
-              </w:rPr>
-              <w:t xml:space="preserve"> (n = 46)</w:t>
+                <w:sz w:val="20"/>
+              </w:rPr>
+              <w:t>Precision</w:t>
             </w:r>
           </w:p>
         </w:tc>
@@ -10812,10 +11286,9 @@
             <w:r>
               <w:rPr>
                 <w:rFonts w:ascii="Times New Roman" w:hAnsi="Times New Roman"/>
-                <w:b/>
-                <w:sz w:val="20"/>
-              </w:rPr>
-              <w:t>FN = 8 (17%) — MISSED</w:t>
+                <w:sz w:val="20"/>
+              </w:rPr>
+              <w:t>85.7%</w:t>
             </w:r>
           </w:p>
         </w:tc>
@@ -10845,7 +11318,193 @@
                 <w:rFonts w:ascii="Times New Roman" w:hAnsi="Times New Roman"/>
                 <w:sz w:val="20"/>
               </w:rPr>
-              <w:t>TP = 38 (83%)</w:t>
+              <w:t>± 2.4 pp</w:t>
+            </w:r>
+          </w:p>
+        </w:tc>
+      </w:tr>
+      <w:tr>
+        <w:tc>
+          <w:tcPr>
+            <w:tcW w:type="dxa" w:w="3120"/>
+            <w:vAlign w:val="top"/>
+            <w:tcBorders>
+              <w:top w:val="single" w:sz="6" w:color="BFBFBF"/>
+              <w:left w:val="single" w:sz="6" w:color="BFBFBF"/>
+              <w:bottom w:val="single" w:sz="6" w:color="BFBFBF"/>
+              <w:right w:val="single" w:sz="6" w:color="BFBFBF"/>
+            </w:tcBorders>
+          </w:tcPr>
+          <w:p>
+            <w:pPr>
+              <w:spacing w:after="40"/>
+            </w:pPr>
+            <w:r>
+              <w:rPr>
+                <w:rFonts w:ascii="Times New Roman" w:hAnsi="Times New Roman"/>
+                <w:sz w:val="20"/>
+              </w:rPr>
+            </w:r>
+            <w:r>
+              <w:rPr>
+                <w:rFonts w:ascii="Times New Roman" w:hAnsi="Times New Roman"/>
+                <w:b/>
+                <w:sz w:val="20"/>
+              </w:rPr>
+              <w:t>Recall</w:t>
+            </w:r>
+          </w:p>
+        </w:tc>
+        <w:tc>
+          <w:tcPr>
+            <w:tcW w:type="dxa" w:w="3120"/>
+            <w:vAlign w:val="top"/>
+            <w:tcBorders>
+              <w:top w:val="single" w:sz="6" w:color="BFBFBF"/>
+              <w:left w:val="single" w:sz="6" w:color="BFBFBF"/>
+              <w:bottom w:val="single" w:sz="6" w:color="BFBFBF"/>
+              <w:right w:val="single" w:sz="6" w:color="BFBFBF"/>
+            </w:tcBorders>
+          </w:tcPr>
+          <w:p>
+            <w:pPr>
+              <w:spacing w:after="40"/>
+            </w:pPr>
+            <w:r>
+              <w:rPr>
+                <w:rFonts w:ascii="Times New Roman" w:hAnsi="Times New Roman"/>
+                <w:sz w:val="20"/>
+              </w:rPr>
+            </w:r>
+            <w:r>
+              <w:rPr>
+                <w:rFonts w:ascii="Times New Roman" w:hAnsi="Times New Roman"/>
+                <w:b/>
+                <w:sz w:val="20"/>
+              </w:rPr>
+              <w:t>79.1%</w:t>
+            </w:r>
+          </w:p>
+        </w:tc>
+        <w:tc>
+          <w:tcPr>
+            <w:tcW w:type="dxa" w:w="3120"/>
+            <w:vAlign w:val="top"/>
+            <w:tcBorders>
+              <w:top w:val="single" w:sz="6" w:color="BFBFBF"/>
+              <w:left w:val="single" w:sz="6" w:color="BFBFBF"/>
+              <w:bottom w:val="single" w:sz="6" w:color="BFBFBF"/>
+              <w:right w:val="single" w:sz="6" w:color="BFBFBF"/>
+            </w:tcBorders>
+          </w:tcPr>
+          <w:p>
+            <w:pPr>
+              <w:spacing w:after="40"/>
+            </w:pPr>
+            <w:r>
+              <w:rPr>
+                <w:rFonts w:ascii="Times New Roman" w:hAnsi="Times New Roman"/>
+                <w:sz w:val="20"/>
+              </w:rPr>
+            </w:r>
+            <w:r>
+              <w:rPr>
+                <w:rFonts w:ascii="Times New Roman" w:hAnsi="Times New Roman"/>
+                <w:sz w:val="20"/>
+              </w:rPr>
+              <w:t>± 8.1 pp</w:t>
+            </w:r>
+          </w:p>
+        </w:tc>
+      </w:tr>
+      <w:tr>
+        <w:tc>
+          <w:tcPr>
+            <w:tcW w:type="dxa" w:w="3120"/>
+            <w:vAlign w:val="top"/>
+            <w:tcBorders>
+              <w:top w:val="single" w:sz="6" w:color="BFBFBF"/>
+              <w:left w:val="single" w:sz="6" w:color="BFBFBF"/>
+              <w:bottom w:val="single" w:sz="6" w:color="BFBFBF"/>
+              <w:right w:val="single" w:sz="6" w:color="BFBFBF"/>
+            </w:tcBorders>
+          </w:tcPr>
+          <w:p>
+            <w:pPr>
+              <w:spacing w:after="40"/>
+            </w:pPr>
+            <w:r>
+              <w:rPr>
+                <w:rFonts w:ascii="Times New Roman" w:hAnsi="Times New Roman"/>
+                <w:sz w:val="20"/>
+              </w:rPr>
+            </w:r>
+            <w:r>
+              <w:rPr>
+                <w:rFonts w:ascii="Times New Roman" w:hAnsi="Times New Roman"/>
+                <w:sz w:val="20"/>
+              </w:rPr>
+              <w:t>F1</w:t>
+            </w:r>
+          </w:p>
+        </w:tc>
+        <w:tc>
+          <w:tcPr>
+            <w:tcW w:type="dxa" w:w="3120"/>
+            <w:vAlign w:val="top"/>
+            <w:tcBorders>
+              <w:top w:val="single" w:sz="6" w:color="BFBFBF"/>
+              <w:left w:val="single" w:sz="6" w:color="BFBFBF"/>
+              <w:bottom w:val="single" w:sz="6" w:color="BFBFBF"/>
+              <w:right w:val="single" w:sz="6" w:color="BFBFBF"/>
+            </w:tcBorders>
+          </w:tcPr>
+          <w:p>
+            <w:pPr>
+              <w:spacing w:after="40"/>
+            </w:pPr>
+            <w:r>
+              <w:rPr>
+                <w:rFonts w:ascii="Times New Roman" w:hAnsi="Times New Roman"/>
+                <w:sz w:val="20"/>
+              </w:rPr>
+            </w:r>
+            <w:r>
+              <w:rPr>
+                <w:rFonts w:ascii="Times New Roman" w:hAnsi="Times New Roman"/>
+                <w:sz w:val="20"/>
+              </w:rPr>
+              <w:t>82.0%</w:t>
+            </w:r>
+          </w:p>
+        </w:tc>
+        <w:tc>
+          <w:tcPr>
+            <w:tcW w:type="dxa" w:w="3120"/>
+            <w:vAlign w:val="top"/>
+            <w:tcBorders>
+              <w:top w:val="single" w:sz="6" w:color="BFBFBF"/>
+              <w:left w:val="single" w:sz="6" w:color="BFBFBF"/>
+              <w:bottom w:val="single" w:sz="6" w:color="BFBFBF"/>
+              <w:right w:val="single" w:sz="6" w:color="BFBFBF"/>
+            </w:tcBorders>
+          </w:tcPr>
+          <w:p>
+            <w:pPr>
+              <w:spacing w:after="40"/>
+            </w:pPr>
+            <w:r>
+              <w:rPr>
+                <w:rFonts w:ascii="Times New Roman" w:hAnsi="Times New Roman"/>
+                <w:sz w:val="20"/>
+              </w:rPr>
+            </w:r>
+            <w:r>
+              <w:rPr>
+                <w:rFonts w:ascii="Times New Roman" w:hAnsi="Times New Roman"/>
+                <w:sz w:val="20"/>
+              </w:rPr>
+              <w:t>± 3.9 pp</w:t>
             </w:r>
           </w:p>
         </w:tc>
@@ -10866,14 +11525,380 @@
           <w:rFonts w:ascii="Times New Roman" w:hAnsi="Times New Roman"/>
           <w:sz w:val="24"/>
         </w:rPr>
-        <w:t xml:space="preserve">The headline result is </w:t>
-      </w:r>
+        <w:t xml:space="preserve">The CV mean recall (79.1%) is within roughly 3.5 percentage points of the hold-out recall (82.6%), indicating that the hold-out is mildly optimistic for the at-risk class but not pathologically so. The relatively wide recall standard deviation (± 8.1 pp) is the most informative caveat: recall on this dataset depends meaningfully on </w:t>
+      </w:r>
+      <w:r>
+        <w:rPr>
+          <w:rFonts w:ascii="Times New Roman" w:hAnsi="Times New Roman"/>
+          <w:i/>
+          <w:sz w:val="24"/>
+        </w:rPr>
+        <w:t>which</w:t>
+      </w:r>
+      <w:r>
+        <w:rPr>
+          <w:rFonts w:ascii="Times New Roman" w:hAnsi="Times New Roman"/>
+          <w:sz w:val="24"/>
+        </w:rPr>
+        <w:t xml:space="preserve"> 209 students happen to be in the test fold — driven by the small at-risk minority (≈46 per fold) and the heterogeneity inside it. Accuracy, precision, and F1 are all stable to within a few percentage points across folds.</w:t>
+      </w:r>
+    </w:p>
+    <w:p>
+      <w:pPr>
+        <w:spacing w:lineRule="auto" w:line="276" w:after="120"/>
+        <w:jc w:val="both"/>
+      </w:pPr>
+      <w:r>
+        <w:rPr>
+          <w:rFonts w:ascii="Times New Roman" w:hAnsi="Times New Roman"/>
+          <w:sz w:val="24"/>
+        </w:rPr>
+        <w:t>The held-out confusion matrix (Table 6) decomposes the Random Forest's aggregate metrics into the four operational outcomes.</w:t>
+      </w:r>
+    </w:p>
+    <w:p>
+      <w:pPr>
+        <w:spacing w:lineRule="auto" w:line="276" w:after="120"/>
+        <w:jc w:val="both"/>
+      </w:pPr>
       <w:r>
         <w:rPr>
           <w:rFonts w:ascii="Times New Roman" w:hAnsi="Times New Roman"/>
           <w:b/>
           <w:sz w:val="24"/>
         </w:rPr>
+        <w:t>Table 6 — Confusion matrix for the Random Forest on the held-out test set</w:t>
+      </w:r>
+    </w:p>
+    <w:tbl>
+      <w:tblPr>
+        <w:tblW w:type="auto" w:w="0"/>
+        <w:tblLayout w:type="autofit"/>
+        <w:tblLook w:firstColumn="1" w:firstRow="1" w:lastColumn="0" w:lastRow="0" w:noHBand="0" w:noVBand="1" w:val="04A0"/>
+      </w:tblPr>
+      <w:tblGrid>
+        <w:gridCol w:w="3120"/>
+        <w:gridCol w:w="3120"/>
+        <w:gridCol w:w="3120"/>
+      </w:tblGrid>
+      <w:tr>
+        <w:tc>
+          <w:tcPr>
+            <w:tcW w:type="dxa" w:w="3120"/>
+            <w:vAlign w:val="top"/>
+            <w:tcBorders>
+              <w:top w:val="single" w:sz="6" w:color="BFBFBF"/>
+              <w:left w:val="single" w:sz="6" w:color="BFBFBF"/>
+              <w:bottom w:val="single" w:sz="6" w:color="BFBFBF"/>
+              <w:right w:val="single" w:sz="6" w:color="BFBFBF"/>
+            </w:tcBorders>
+            <w:shd w:val="clear" w:color="auto" w:fill="D9E1F2"/>
+          </w:tcPr>
+          <w:p>
+            <w:pPr>
+              <w:spacing w:after="40"/>
+            </w:pPr>
+            <w:r>
+              <w:rPr>
+                <w:rFonts w:ascii="Times New Roman" w:hAnsi="Times New Roman"/>
+                <w:b/>
+                <w:sz w:val="20"/>
+              </w:rPr>
+            </w:r>
+          </w:p>
+        </w:tc>
+        <w:tc>
+          <w:tcPr>
+            <w:tcW w:type="dxa" w:w="3120"/>
+            <w:vAlign w:val="top"/>
+            <w:tcBorders>
+              <w:top w:val="single" w:sz="6" w:color="BFBFBF"/>
+              <w:left w:val="single" w:sz="6" w:color="BFBFBF"/>
+              <w:bottom w:val="single" w:sz="6" w:color="BFBFBF"/>
+              <w:right w:val="single" w:sz="6" w:color="BFBFBF"/>
+            </w:tcBorders>
+            <w:shd w:val="clear" w:color="auto" w:fill="D9E1F2"/>
+          </w:tcPr>
+          <w:p>
+            <w:pPr>
+              <w:spacing w:after="40"/>
+            </w:pPr>
+            <w:r>
+              <w:rPr>
+                <w:rFonts w:ascii="Times New Roman" w:hAnsi="Times New Roman"/>
+                <w:b/>
+                <w:sz w:val="20"/>
+              </w:rPr>
+            </w:r>
+            <w:r>
+              <w:rPr>
+                <w:rFonts w:ascii="Times New Roman" w:hAnsi="Times New Roman"/>
+                <w:b/>
+                <w:sz w:val="20"/>
+              </w:rPr>
+              <w:t>Predicted Pass</w:t>
+            </w:r>
+          </w:p>
+        </w:tc>
+        <w:tc>
+          <w:tcPr>
+            <w:tcW w:type="dxa" w:w="3120"/>
+            <w:vAlign w:val="top"/>
+            <w:tcBorders>
+              <w:top w:val="single" w:sz="6" w:color="BFBFBF"/>
+              <w:left w:val="single" w:sz="6" w:color="BFBFBF"/>
+              <w:bottom w:val="single" w:sz="6" w:color="BFBFBF"/>
+              <w:right w:val="single" w:sz="6" w:color="BFBFBF"/>
+            </w:tcBorders>
+            <w:shd w:val="clear" w:color="auto" w:fill="D9E1F2"/>
+          </w:tcPr>
+          <w:p>
+            <w:pPr>
+              <w:spacing w:after="40"/>
+            </w:pPr>
+            <w:r>
+              <w:rPr>
+                <w:rFonts w:ascii="Times New Roman" w:hAnsi="Times New Roman"/>
+                <w:b/>
+                <w:sz w:val="20"/>
+              </w:rPr>
+            </w:r>
+            <w:r>
+              <w:rPr>
+                <w:rFonts w:ascii="Times New Roman" w:hAnsi="Times New Roman"/>
+                <w:b/>
+                <w:sz w:val="20"/>
+              </w:rPr>
+              <w:t>Predicted At-Risk</w:t>
+            </w:r>
+          </w:p>
+        </w:tc>
+      </w:tr>
+      <w:tr>
+        <w:tc>
+          <w:tcPr>
+            <w:tcW w:type="dxa" w:w="3120"/>
+            <w:vAlign w:val="top"/>
+            <w:tcBorders>
+              <w:top w:val="single" w:sz="6" w:color="BFBFBF"/>
+              <w:left w:val="single" w:sz="6" w:color="BFBFBF"/>
+              <w:bottom w:val="single" w:sz="6" w:color="BFBFBF"/>
+              <w:right w:val="single" w:sz="6" w:color="BFBFBF"/>
+            </w:tcBorders>
+          </w:tcPr>
+          <w:p>
+            <w:pPr>
+              <w:spacing w:after="40"/>
+            </w:pPr>
+            <w:r>
+              <w:rPr>
+                <w:rFonts w:ascii="Times New Roman" w:hAnsi="Times New Roman"/>
+                <w:sz w:val="20"/>
+              </w:rPr>
+            </w:r>
+            <w:r>
+              <w:rPr>
+                <w:rFonts w:ascii="Times New Roman" w:hAnsi="Times New Roman"/>
+                <w:b/>
+                <w:sz w:val="20"/>
+              </w:rPr>
+              <w:t>Actually Pass</w:t>
+            </w:r>
+            <w:r>
+              <w:rPr>
+                <w:rFonts w:ascii="Times New Roman" w:hAnsi="Times New Roman"/>
+                <w:sz w:val="20"/>
+              </w:rPr>
+              <w:t xml:space="preserve"> (n = 163)</w:t>
+            </w:r>
+          </w:p>
+        </w:tc>
+        <w:tc>
+          <w:tcPr>
+            <w:tcW w:type="dxa" w:w="3120"/>
+            <w:vAlign w:val="top"/>
+            <w:tcBorders>
+              <w:top w:val="single" w:sz="6" w:color="BFBFBF"/>
+              <w:left w:val="single" w:sz="6" w:color="BFBFBF"/>
+              <w:bottom w:val="single" w:sz="6" w:color="BFBFBF"/>
+              <w:right w:val="single" w:sz="6" w:color="BFBFBF"/>
+            </w:tcBorders>
+          </w:tcPr>
+          <w:p>
+            <w:pPr>
+              <w:spacing w:after="40"/>
+            </w:pPr>
+            <w:r>
+              <w:rPr>
+                <w:rFonts w:ascii="Times New Roman" w:hAnsi="Times New Roman"/>
+                <w:sz w:val="20"/>
+              </w:rPr>
+            </w:r>
+            <w:r>
+              <w:rPr>
+                <w:rFonts w:ascii="Times New Roman" w:hAnsi="Times New Roman"/>
+                <w:sz w:val="20"/>
+              </w:rPr>
+              <w:t>TN = 153 (94%)</w:t>
+            </w:r>
+          </w:p>
+        </w:tc>
+        <w:tc>
+          <w:tcPr>
+            <w:tcW w:type="dxa" w:w="3120"/>
+            <w:vAlign w:val="top"/>
+            <w:tcBorders>
+              <w:top w:val="single" w:sz="6" w:color="BFBFBF"/>
+              <w:left w:val="single" w:sz="6" w:color="BFBFBF"/>
+              <w:bottom w:val="single" w:sz="6" w:color="BFBFBF"/>
+              <w:right w:val="single" w:sz="6" w:color="BFBFBF"/>
+            </w:tcBorders>
+          </w:tcPr>
+          <w:p>
+            <w:pPr>
+              <w:spacing w:after="40"/>
+            </w:pPr>
+            <w:r>
+              <w:rPr>
+                <w:rFonts w:ascii="Times New Roman" w:hAnsi="Times New Roman"/>
+                <w:sz w:val="20"/>
+              </w:rPr>
+            </w:r>
+            <w:r>
+              <w:rPr>
+                <w:rFonts w:ascii="Times New Roman" w:hAnsi="Times New Roman"/>
+                <w:sz w:val="20"/>
+              </w:rPr>
+              <w:t>FP = 10 (6%)</w:t>
+            </w:r>
+          </w:p>
+        </w:tc>
+      </w:tr>
+      <w:tr>
+        <w:tc>
+          <w:tcPr>
+            <w:tcW w:type="dxa" w:w="3120"/>
+            <w:vAlign w:val="top"/>
+            <w:tcBorders>
+              <w:top w:val="single" w:sz="6" w:color="BFBFBF"/>
+              <w:left w:val="single" w:sz="6" w:color="BFBFBF"/>
+              <w:bottom w:val="single" w:sz="6" w:color="BFBFBF"/>
+              <w:right w:val="single" w:sz="6" w:color="BFBFBF"/>
+            </w:tcBorders>
+          </w:tcPr>
+          <w:p>
+            <w:pPr>
+              <w:spacing w:after="40"/>
+            </w:pPr>
+            <w:r>
+              <w:rPr>
+                <w:rFonts w:ascii="Times New Roman" w:hAnsi="Times New Roman"/>
+                <w:sz w:val="20"/>
+              </w:rPr>
+            </w:r>
+            <w:r>
+              <w:rPr>
+                <w:rFonts w:ascii="Times New Roman" w:hAnsi="Times New Roman"/>
+                <w:b/>
+                <w:sz w:val="20"/>
+              </w:rPr>
+              <w:t>Actually At-Risk</w:t>
+            </w:r>
+            <w:r>
+              <w:rPr>
+                <w:rFonts w:ascii="Times New Roman" w:hAnsi="Times New Roman"/>
+                <w:sz w:val="20"/>
+              </w:rPr>
+              <w:t xml:space="preserve"> (n = 46)</w:t>
+            </w:r>
+          </w:p>
+        </w:tc>
+        <w:tc>
+          <w:tcPr>
+            <w:tcW w:type="dxa" w:w="3120"/>
+            <w:vAlign w:val="top"/>
+            <w:tcBorders>
+              <w:top w:val="single" w:sz="6" w:color="BFBFBF"/>
+              <w:left w:val="single" w:sz="6" w:color="BFBFBF"/>
+              <w:bottom w:val="single" w:sz="6" w:color="BFBFBF"/>
+              <w:right w:val="single" w:sz="6" w:color="BFBFBF"/>
+            </w:tcBorders>
+          </w:tcPr>
+          <w:p>
+            <w:pPr>
+              <w:spacing w:after="40"/>
+            </w:pPr>
+            <w:r>
+              <w:rPr>
+                <w:rFonts w:ascii="Times New Roman" w:hAnsi="Times New Roman"/>
+                <w:sz w:val="20"/>
+              </w:rPr>
+            </w:r>
+            <w:r>
+              <w:rPr>
+                <w:rFonts w:ascii="Times New Roman" w:hAnsi="Times New Roman"/>
+                <w:b/>
+                <w:sz w:val="20"/>
+              </w:rPr>
+              <w:t>FN = 8 (17%) — MISSED</w:t>
+            </w:r>
+          </w:p>
+        </w:tc>
+        <w:tc>
+          <w:tcPr>
+            <w:tcW w:type="dxa" w:w="3120"/>
+            <w:vAlign w:val="top"/>
+            <w:tcBorders>
+              <w:top w:val="single" w:sz="6" w:color="BFBFBF"/>
+              <w:left w:val="single" w:sz="6" w:color="BFBFBF"/>
+              <w:bottom w:val="single" w:sz="6" w:color="BFBFBF"/>
+              <w:right w:val="single" w:sz="6" w:color="BFBFBF"/>
+            </w:tcBorders>
+          </w:tcPr>
+          <w:p>
+            <w:pPr>
+              <w:spacing w:after="40"/>
+            </w:pPr>
+            <w:r>
+              <w:rPr>
+                <w:rFonts w:ascii="Times New Roman" w:hAnsi="Times New Roman"/>
+                <w:sz w:val="20"/>
+              </w:rPr>
+            </w:r>
+            <w:r>
+              <w:rPr>
+                <w:rFonts w:ascii="Times New Roman" w:hAnsi="Times New Roman"/>
+                <w:sz w:val="20"/>
+              </w:rPr>
+              <w:t>TP = 38 (83%)</w:t>
+            </w:r>
+          </w:p>
+        </w:tc>
+      </w:tr>
+    </w:tbl>
+    <w:p>
+      <w:pPr>
+        <w:spacing w:after="120"/>
+      </w:pPr>
+    </w:p>
+    <w:p>
+      <w:pPr>
+        <w:spacing w:lineRule="auto" w:line="276" w:after="120"/>
+        <w:jc w:val="both"/>
+      </w:pPr>
+      <w:r>
+        <w:rPr>
+          <w:rFonts w:ascii="Times New Roman" w:hAnsi="Times New Roman"/>
+          <w:sz w:val="24"/>
+        </w:rPr>
+        <w:t xml:space="preserve">The headline operational result is </w:t>
+      </w:r>
+      <w:r>
+        <w:rPr>
+          <w:rFonts w:ascii="Times New Roman" w:hAnsi="Times New Roman"/>
+          <w:b/>
+          <w:sz w:val="24"/>
+        </w:rPr>
         <w:t>recall = 82.6%</w:t>
       </w:r>
       <w:r>
@@ -10881,7 +11906,7 @@
           <w:rFonts w:ascii="Times New Roman" w:hAnsi="Times New Roman"/>
           <w:sz w:val="24"/>
         </w:rPr>
-        <w:t xml:space="preserve"> — the model catches 38 of 46 at-risk students on the test set. Eight at-risk students are missed (the false-negative cell, rendered in red in the dashboard). Ten passing students are flagged falsely (the false-positive cell). In an early-warning context, a false negative is operationally more costly than a false positive — a missed student receives no intervention; a falsely flagged student receives a check-in conversation that costs only the teacher's time. The dashboard surfaces this asymmetry deliberately.</w:t>
+        <w:t xml:space="preserve"> — the deployed Random Forest catches 38 of 46 at-risk students on the test set. Eight at-risk students are missed (the false-negative cell, rendered in red in the dashboard). Ten passing students are flagged falsely (the false-positive cell). In an early-warning context, a false negative is operationally more costly than a false positive — a missed student receives no intervention; a falsely flagged student receives a check-in conversation that costs only the teacher's time. The dashboard surfaces this asymmetry deliberately.</w:t>
       </w:r>
     </w:p>
     <w:p>
@@ -11203,7 +12228,7 @@
           <w:rFonts w:ascii="Times New Roman" w:hAnsi="Times New Roman"/>
           <w:sz w:val="24"/>
         </w:rPr>
-        <w:t>We list five concrete limitations of the present system.</w:t>
+        <w:t>We list four concrete limitations of the present system.</w:t>
       </w:r>
     </w:p>
     <w:p>
@@ -11252,28 +12277,7 @@
           <w:rFonts w:ascii="Times New Roman" w:hAnsi="Times New Roman"/>
           <w:sz w:val="24"/>
         </w:rPr>
-        <w:t xml:space="preserve"> regenerates the cleaned CSV but these numbers must be copied across manually. The trade-off (no build step) is acceptable for this project but would not scale to a production deployment with frequent data updates.</w:t>
-      </w:r>
-    </w:p>
-    <w:p>
-      <w:pPr>
-        <w:pStyle w:val="ListNumber"/>
-        <w:spacing w:lineRule="auto" w:line="276" w:after="40"/>
-      </w:pPr>
-      <w:r>
-        <w:rPr>
-          <w:rFonts w:ascii="Times New Roman" w:hAnsi="Times New Roman"/>
-          <w:b/>
-          <w:sz w:val="24"/>
-        </w:rPr>
-        <w:t>Single eighty-twenty hold-out.</w:t>
-      </w:r>
-      <w:r>
-        <w:rPr>
-          <w:rFonts w:ascii="Times New Roman" w:hAnsi="Times New Roman"/>
-          <w:sz w:val="24"/>
-        </w:rPr>
-        <w:t xml:space="preserve"> The reported metrics are based on a single stratified hold-out split rather than k-fold cross-validation or bootstrap resampling. The metrics are therefore point estimates with no associated confidence interval. K-fold cross-validation would strengthen the empirical claim at modest computational cost.</w:t>
+        <w:t xml:space="preserve"> regenerates the cleaned CSV and recomputes the cross-validation and baseline numbers, but the figures displayed on the dashboard must be copied across manually. The trade-off (no build step) is acceptable for this project but would not scale to a production deployment with frequent data updates.</w:t>
       </w:r>
     </w:p>
     <w:p>

</xml_diff>